<commit_message>
human in the loop
</commit_message>
<xml_diff>
--- a/LangChain/Middleware/Middleware.docx
+++ b/LangChain/Middleware/Middleware.docx
@@ -88,6 +88,7 @@
       </w:pPr>
       <w:r>
         <w:rPr>
+          <w:noProof/>
           <w:lang w:val="en-US"/>
         </w:rPr>
         <w:drawing>
@@ -239,11 +240,39 @@
       <w:pPr>
         <w:ind w:left="360"/>
         <w:rPr>
-          <w:lang w:val="en-US"/>
-        </w:rPr>
-      </w:pPr>
-      <w:r>
-        <w:rPr>
+          <w:noProof/>
+          <w:lang w:val="en-US"/>
+        </w:rPr>
+      </w:pPr>
+    </w:p>
+    <w:p>
+      <w:pPr>
+        <w:ind w:left="360"/>
+        <w:rPr>
+          <w:noProof/>
+          <w:lang w:val="en-US"/>
+        </w:rPr>
+      </w:pPr>
+    </w:p>
+    <w:p>
+      <w:pPr>
+        <w:ind w:left="360"/>
+        <w:rPr>
+          <w:noProof/>
+          <w:lang w:val="en-US"/>
+        </w:rPr>
+      </w:pPr>
+    </w:p>
+    <w:p>
+      <w:pPr>
+        <w:ind w:left="360"/>
+        <w:rPr>
+          <w:lang w:val="en-US"/>
+        </w:rPr>
+      </w:pPr>
+      <w:r>
+        <w:rPr>
+          <w:noProof/>
           <w:lang w:val="en-US"/>
         </w:rPr>
         <w:lastRenderedPageBreak/>
@@ -284,6 +313,582 @@
         </w:drawing>
       </w:r>
     </w:p>
+    <w:p>
+      <w:pPr>
+        <w:rPr>
+          <w:b/>
+          <w:bCs/>
+          <w:lang w:val="en-US"/>
+        </w:rPr>
+      </w:pPr>
+      <w:r>
+        <w:rPr>
+          <w:b/>
+          <w:bCs/>
+          <w:lang w:val="en-US"/>
+        </w:rPr>
+        <w:t>Summarization:</w:t>
+      </w:r>
+    </w:p>
+    <w:p>
+      <w:pPr>
+        <w:rPr>
+          <w:lang w:val="en-US"/>
+        </w:rPr>
+      </w:pPr>
+      <w:r>
+        <w:rPr>
+          <w:lang w:val="en-US"/>
+        </w:rPr>
+        <w:t xml:space="preserve">Automatically summarize the conversation when it is reaching token </w:t>
+      </w:r>
+      <w:proofErr w:type="gramStart"/>
+      <w:r>
+        <w:rPr>
+          <w:lang w:val="en-US"/>
+        </w:rPr>
+        <w:t xml:space="preserve">limit </w:t>
+      </w:r>
+      <w:r>
+        <w:rPr>
+          <w:lang w:val="en-US"/>
+        </w:rPr>
+        <w:t>,</w:t>
+      </w:r>
+      <w:proofErr w:type="gramEnd"/>
+      <w:r>
+        <w:rPr>
+          <w:lang w:val="en-US"/>
+        </w:rPr>
+        <w:t xml:space="preserve"> keeping latest messages while compressing older context</w:t>
+      </w:r>
+    </w:p>
+    <w:p>
+      <w:pPr>
+        <w:pStyle w:val="ListParagraph"/>
+        <w:numPr>
+          <w:ilvl w:val="0"/>
+          <w:numId w:val="2"/>
+        </w:numPr>
+        <w:rPr>
+          <w:lang w:val="en-US"/>
+        </w:rPr>
+      </w:pPr>
+      <w:r>
+        <w:rPr>
+          <w:lang w:val="en-US"/>
+        </w:rPr>
+        <w:t xml:space="preserve">Long conversation which </w:t>
+      </w:r>
+      <w:proofErr w:type="gramStart"/>
+      <w:r>
+        <w:rPr>
+          <w:lang w:val="en-US"/>
+        </w:rPr>
+        <w:t>exceed</w:t>
+      </w:r>
+      <w:proofErr w:type="gramEnd"/>
+      <w:r>
+        <w:rPr>
+          <w:lang w:val="en-US"/>
+        </w:rPr>
+        <w:t xml:space="preserve"> token limit </w:t>
+      </w:r>
+    </w:p>
+    <w:p>
+      <w:pPr>
+        <w:pStyle w:val="ListParagraph"/>
+        <w:numPr>
+          <w:ilvl w:val="0"/>
+          <w:numId w:val="2"/>
+        </w:numPr>
+        <w:rPr>
+          <w:lang w:val="en-US"/>
+        </w:rPr>
+      </w:pPr>
+      <w:r>
+        <w:rPr>
+          <w:lang w:val="en-US"/>
+        </w:rPr>
+        <w:t>Application when it is needed</w:t>
+      </w:r>
+    </w:p>
+    <w:p>
+      <w:pPr>
+        <w:rPr>
+          <w:lang w:val="en-US"/>
+        </w:rPr>
+      </w:pPr>
+      <w:r>
+        <w:rPr>
+          <w:lang w:val="en-US"/>
+        </w:rPr>
+        <w:t xml:space="preserve">Summarization is a text context compression, it won’t resize or resample or compress multimodal like audio/video/image, while latest multi modal is </w:t>
+      </w:r>
+      <w:proofErr w:type="gramStart"/>
+      <w:r>
+        <w:rPr>
+          <w:lang w:val="en-US"/>
+        </w:rPr>
+        <w:t>retained  whereas</w:t>
+      </w:r>
+      <w:proofErr w:type="gramEnd"/>
+      <w:r>
+        <w:rPr>
+          <w:lang w:val="en-US"/>
+        </w:rPr>
+        <w:t xml:space="preserve"> older multi modal conversation especially media application, those are stored in file system or object store and pass the URL or file references while text compress</w:t>
+      </w:r>
+    </w:p>
+    <w:p>
+      <w:pPr>
+        <w:rPr>
+          <w:lang w:val="en-US"/>
+        </w:rPr>
+      </w:pPr>
+      <w:r>
+        <w:rPr>
+          <w:lang w:val="en-US"/>
+        </w:rPr>
+        <w:br w:type="page"/>
+      </w:r>
+    </w:p>
+    <w:p>
+      <w:pPr>
+        <w:rPr>
+          <w:lang w:val="en-US"/>
+        </w:rPr>
+      </w:pPr>
+      <w:r>
+        <w:rPr>
+          <w:lang w:val="en-US"/>
+        </w:rPr>
+        <w:lastRenderedPageBreak/>
+        <w:t xml:space="preserve">Model – </w:t>
+      </w:r>
+      <w:proofErr w:type="spellStart"/>
+      <w:r>
+        <w:rPr>
+          <w:lang w:val="en-US"/>
+        </w:rPr>
+        <w:t>mandt</w:t>
+      </w:r>
+      <w:proofErr w:type="spellEnd"/>
+      <w:r>
+        <w:rPr>
+          <w:lang w:val="en-US"/>
+        </w:rPr>
+        <w:t xml:space="preserve"> is to tell which model used for text compression</w:t>
+      </w:r>
+    </w:p>
+    <w:p>
+      <w:pPr>
+        <w:rPr>
+          <w:lang w:val="en-US"/>
+        </w:rPr>
+      </w:pPr>
+      <w:r>
+        <w:rPr>
+          <w:lang w:val="en-US"/>
+        </w:rPr>
+        <w:t>Trigger – starts summarization when condition is met</w:t>
+      </w:r>
+    </w:p>
+    <w:p>
+      <w:pPr>
+        <w:rPr>
+          <w:lang w:val="en-US"/>
+        </w:rPr>
+      </w:pPr>
+      <w:r>
+        <w:rPr>
+          <w:lang w:val="en-US"/>
+        </w:rPr>
+        <w:t>Keep – informing model to keep messages based on given conditions</w:t>
+      </w:r>
+    </w:p>
+    <w:p>
+      <w:pPr>
+        <w:rPr>
+          <w:lang w:val="en-US"/>
+        </w:rPr>
+      </w:pPr>
+      <w:r>
+        <w:rPr>
+          <w:lang w:val="en-US"/>
+        </w:rPr>
+        <w:t>Token – number to give tokens limit</w:t>
+      </w:r>
+    </w:p>
+    <w:p>
+      <w:pPr>
+        <w:rPr>
+          <w:lang w:val="en-US"/>
+        </w:rPr>
+      </w:pPr>
+      <w:r>
+        <w:rPr>
+          <w:lang w:val="en-US"/>
+        </w:rPr>
+        <w:t>Messages – number to give limit</w:t>
+      </w:r>
+    </w:p>
+    <w:p>
+      <w:pPr>
+        <w:rPr>
+          <w:lang w:val="en-US"/>
+        </w:rPr>
+      </w:pPr>
+      <w:r>
+        <w:rPr>
+          <w:lang w:val="en-US"/>
+        </w:rPr>
+        <w:t>Friction – percentage when you give 0.3 means starts summarization when token limit reached 30%</w:t>
+      </w:r>
+    </w:p>
+    <w:p>
+      <w:pPr>
+        <w:rPr>
+          <w:b/>
+          <w:bCs/>
+          <w:lang w:val="en-US"/>
+        </w:rPr>
+      </w:pPr>
+      <w:r>
+        <w:rPr>
+          <w:b/>
+          <w:bCs/>
+          <w:lang w:val="en-US"/>
+        </w:rPr>
+        <w:t>Human in the loop:</w:t>
+      </w:r>
+    </w:p>
+    <w:p>
+      <w:pPr>
+        <w:rPr>
+          <w:lang w:val="en-US"/>
+        </w:rPr>
+      </w:pPr>
+      <w:r>
+        <w:rPr>
+          <w:lang w:val="en-US"/>
+        </w:rPr>
+        <w:t xml:space="preserve">Pause agent execution for human approval, edit or rejecting the tool before the tool call </w:t>
+      </w:r>
+    </w:p>
+    <w:p>
+      <w:pPr>
+        <w:rPr>
+          <w:lang w:val="en-US"/>
+        </w:rPr>
+      </w:pPr>
+      <w:r>
+        <w:rPr>
+          <w:lang w:val="en-US"/>
+        </w:rPr>
+        <w:t xml:space="preserve">Example: </w:t>
+      </w:r>
+    </w:p>
+    <w:p>
+      <w:pPr>
+        <w:rPr>
+          <w:lang w:val="en-US"/>
+        </w:rPr>
+      </w:pPr>
+      <w:r>
+        <w:rPr>
+          <w:lang w:val="en-US"/>
+        </w:rPr>
+        <w:t xml:space="preserve">High-stake operation </w:t>
+      </w:r>
+    </w:p>
+    <w:p>
+      <w:pPr>
+        <w:rPr>
+          <w:lang w:val="en-US"/>
+        </w:rPr>
+      </w:pPr>
+      <w:r>
+        <w:rPr>
+          <w:lang w:val="en-US"/>
+        </w:rPr>
+        <w:t>Based on business case</w:t>
+      </w:r>
+    </w:p>
+    <w:p>
+      <w:pPr>
+        <w:rPr>
+          <w:lang w:val="en-US"/>
+        </w:rPr>
+      </w:pPr>
+      <w:r>
+        <w:rPr>
+          <w:lang w:val="en-US"/>
+        </w:rPr>
+        <w:t>Sending email to stake holders</w:t>
+      </w:r>
+    </w:p>
+    <w:p>
+      <w:pPr>
+        <w:rPr>
+          <w:lang w:val="en-US"/>
+        </w:rPr>
+      </w:pPr>
+      <w:r>
+        <w:rPr>
+          <w:lang w:val="en-US"/>
+        </w:rPr>
+        <w:t>Buy any new investment</w:t>
+      </w:r>
+    </w:p>
+    <w:p>
+      <w:pPr>
+        <w:rPr>
+          <w:lang w:val="en-US"/>
+        </w:rPr>
+      </w:pPr>
+      <w:r>
+        <w:rPr>
+          <w:lang w:val="en-US"/>
+        </w:rPr>
+        <w:t>Settle money</w:t>
+      </w:r>
+    </w:p>
+    <w:p>
+      <w:pPr>
+        <w:rPr>
+          <w:lang w:val="en-US"/>
+        </w:rPr>
+      </w:pPr>
+      <w:proofErr w:type="spellStart"/>
+      <w:r>
+        <w:rPr>
+          <w:lang w:val="en-US"/>
+        </w:rPr>
+        <w:t>Etc</w:t>
+      </w:r>
+      <w:proofErr w:type="spellEnd"/>
+    </w:p>
+    <w:p>
+      <w:pPr>
+        <w:rPr>
+          <w:lang w:val="en-US"/>
+        </w:rPr>
+      </w:pPr>
+      <w:r>
+        <w:rPr>
+          <w:lang w:val="en-US"/>
+        </w:rPr>
+        <w:t xml:space="preserve">By </w:t>
+      </w:r>
+      <w:proofErr w:type="gramStart"/>
+      <w:r>
+        <w:rPr>
+          <w:lang w:val="en-US"/>
+        </w:rPr>
+        <w:t>default :</w:t>
+      </w:r>
+      <w:proofErr w:type="gramEnd"/>
+      <w:r>
+        <w:rPr>
+          <w:lang w:val="en-US"/>
+        </w:rPr>
+        <w:t xml:space="preserve"> you can configure any option only from </w:t>
+      </w:r>
+      <w:proofErr w:type="gramStart"/>
+      <w:r>
+        <w:rPr>
+          <w:lang w:val="en-US"/>
+        </w:rPr>
+        <w:t>approve</w:t>
+      </w:r>
+      <w:proofErr w:type="gramEnd"/>
+      <w:r>
+        <w:rPr>
+          <w:lang w:val="en-US"/>
+        </w:rPr>
+        <w:t xml:space="preserve"> or reject or edit or respond, other options cannot be included</w:t>
+      </w:r>
+    </w:p>
+    <w:p>
+      <w:pPr>
+        <w:rPr>
+          <w:lang w:val="en-US"/>
+        </w:rPr>
+      </w:pPr>
+      <w:r>
+        <w:rPr>
+          <w:lang w:val="en-US"/>
+        </w:rPr>
+        <w:t xml:space="preserve">When a model proposes an action might </w:t>
+      </w:r>
+      <w:proofErr w:type="gramStart"/>
+      <w:r>
+        <w:rPr>
+          <w:lang w:val="en-US"/>
+        </w:rPr>
+        <w:t>needs</w:t>
+      </w:r>
+      <w:proofErr w:type="gramEnd"/>
+      <w:r>
+        <w:rPr>
+          <w:lang w:val="en-US"/>
+        </w:rPr>
+        <w:t xml:space="preserve"> </w:t>
+      </w:r>
+      <w:proofErr w:type="gramStart"/>
+      <w:r>
+        <w:rPr>
+          <w:lang w:val="en-US"/>
+        </w:rPr>
+        <w:t>an approval</w:t>
+      </w:r>
+      <w:proofErr w:type="gramEnd"/>
+      <w:r>
+        <w:rPr>
+          <w:lang w:val="en-US"/>
+        </w:rPr>
+        <w:t xml:space="preserve">, middleware pauses the execution and </w:t>
+      </w:r>
+      <w:proofErr w:type="gramStart"/>
+      <w:r>
+        <w:rPr>
+          <w:lang w:val="en-US"/>
+        </w:rPr>
+        <w:t>wait</w:t>
+      </w:r>
+      <w:proofErr w:type="gramEnd"/>
+      <w:r>
+        <w:rPr>
+          <w:lang w:val="en-US"/>
+        </w:rPr>
+        <w:t xml:space="preserve"> for decision form user, this can be done by checking each tool against configurable policy, if intervention is needed it pauses the execution</w:t>
+      </w:r>
+    </w:p>
+    <w:p>
+      <w:pPr>
+        <w:rPr>
+          <w:lang w:val="en-US"/>
+        </w:rPr>
+      </w:pPr>
+      <w:r>
+        <w:rPr>
+          <w:lang w:val="en-US"/>
+        </w:rPr>
+        <w:t xml:space="preserve">When multiple </w:t>
+      </w:r>
+      <w:proofErr w:type="gramStart"/>
+      <w:r>
+        <w:rPr>
+          <w:lang w:val="en-US"/>
+        </w:rPr>
+        <w:t>tool</w:t>
+      </w:r>
+      <w:proofErr w:type="gramEnd"/>
+      <w:r>
+        <w:rPr>
+          <w:lang w:val="en-US"/>
+        </w:rPr>
+        <w:t xml:space="preserve"> paused at same time, then each tool must get decision result from </w:t>
+      </w:r>
+      <w:proofErr w:type="gramStart"/>
+      <w:r>
+        <w:rPr>
+          <w:lang w:val="en-US"/>
+        </w:rPr>
+        <w:t>user</w:t>
+      </w:r>
+      <w:proofErr w:type="gramEnd"/>
+      <w:r>
+        <w:rPr>
+          <w:lang w:val="en-US"/>
+        </w:rPr>
+        <w:t xml:space="preserve"> and it must be in the same order as how it sent to pause</w:t>
+      </w:r>
+    </w:p>
+    <w:p>
+      <w:pPr>
+        <w:rPr>
+          <w:lang w:val="en-US"/>
+        </w:rPr>
+      </w:pPr>
+      <w:r>
+        <w:rPr>
+          <w:highlight w:val="yellow"/>
+          <w:lang w:val="en-US"/>
+        </w:rPr>
+        <w:t xml:space="preserve">Human in the </w:t>
+      </w:r>
+      <w:proofErr w:type="gramStart"/>
+      <w:r>
+        <w:rPr>
+          <w:highlight w:val="yellow"/>
+          <w:lang w:val="en-US"/>
+        </w:rPr>
+        <w:t>loop[</w:t>
+      </w:r>
+      <w:proofErr w:type="gramEnd"/>
+      <w:r>
+        <w:rPr>
+          <w:highlight w:val="yellow"/>
+          <w:lang w:val="en-US"/>
+        </w:rPr>
+        <w:t xml:space="preserve">HITL] requires </w:t>
+      </w:r>
+      <w:proofErr w:type="spellStart"/>
+      <w:r>
+        <w:rPr>
+          <w:highlight w:val="yellow"/>
+          <w:lang w:val="en-US"/>
+        </w:rPr>
+        <w:t>checkpointer</w:t>
+      </w:r>
+      <w:proofErr w:type="spellEnd"/>
+      <w:r>
+        <w:rPr>
+          <w:highlight w:val="yellow"/>
+          <w:lang w:val="en-US"/>
+        </w:rPr>
+        <w:t xml:space="preserve"> memory saver, it is because when tool is sent for decision, agent must know which tool is got decision from user, without </w:t>
+      </w:r>
+      <w:proofErr w:type="spellStart"/>
+      <w:r>
+        <w:rPr>
+          <w:highlight w:val="yellow"/>
+          <w:lang w:val="en-US"/>
+        </w:rPr>
+        <w:t>checkpointer</w:t>
+      </w:r>
+      <w:proofErr w:type="spellEnd"/>
+      <w:r>
+        <w:rPr>
+          <w:highlight w:val="yellow"/>
+          <w:lang w:val="en-US"/>
+        </w:rPr>
+        <w:t xml:space="preserve"> and thread ID, agent cannot send full conversation history to model</w:t>
+      </w:r>
+    </w:p>
+    <w:p>
+      <w:pPr>
+        <w:rPr>
+          <w:lang w:val="en-US"/>
+        </w:rPr>
+      </w:pPr>
+    </w:p>
+    <w:p>
+      <w:pPr>
+        <w:rPr>
+          <w:lang w:val="en-US"/>
+        </w:rPr>
+      </w:pPr>
+    </w:p>
+    <w:p>
+      <w:pPr>
+        <w:rPr>
+          <w:lang w:val="en-US"/>
+        </w:rPr>
+      </w:pPr>
+    </w:p>
     <w:sectPr>
       <w:pgSz w:w="12240" w:h="15840"/>
       <w:pgMar w:top="1440" w:right="1440" w:bottom="1440" w:left="1440" w:header="708" w:footer="708" w:gutter="0"/>
@@ -297,9 +902,9 @@
 <file path=word/numbering.xml><?xml version="1.0" encoding="utf-8"?>
 <w:numbering xmlns:wpc="http://schemas.microsoft.com/office/word/2010/wordprocessingCanvas" xmlns:cx="http://schemas.microsoft.com/office/drawing/2014/chartex" xmlns:cx1="http://schemas.microsoft.com/office/drawing/2015/9/8/chartex" xmlns:cx2="http://schemas.microsoft.com/office/drawing/2015/10/21/chartex" xmlns:cx3="http://schemas.microsoft.com/office/drawing/2016/5/9/chartex" xmlns:cx4="http://schemas.microsoft.com/office/drawing/2016/5/10/chartex" xmlns:cx5="http://schemas.microsoft.com/office/drawing/2016/5/11/chartex" xmlns:cx6="http://schemas.microsoft.com/office/drawing/2016/5/12/chartex" xmlns:cx7="http://schemas.microsoft.com/office/drawing/2016/5/13/chartex" xmlns:cx8="http://schemas.microsoft.com/office/drawing/2016/5/14/chartex" xmlns:mc="http://schemas.openxmlformats.org/markup-compatibility/2006" xmlns:aink="http://schemas.microsoft.com/office/drawing/2016/ink" xmlns:am3d="http://schemas.microsoft.com/office/drawing/2017/model3d" xmlns:o="urn:schemas-microsoft-com:office:office" xmlns:oel="http://schemas.microsoft.com/office/2019/extlst" xmlns:r="http://schemas.openxmlformats.org/officeDocument/2006/relationships" xmlns:m="http://schemas.openxmlformats.org/officeDocument/2006/math" xmlns:v="urn:schemas-microsoft-com:vml" xmlns:wp14="http://schemas.microsoft.com/office/word/2010/wordprocessingDrawing" xmlns:wp="http://schemas.openxmlformats.org/drawingml/2006/wordprocessingDrawing" xmlns:w10="urn:schemas-microsoft-com:office:word" xmlns:w="http://schemas.openxmlformats.org/wordprocessingml/2006/main" xmlns:w14="http://schemas.microsoft.com/office/word/2010/wordml" xmlns:w15="http://schemas.microsoft.com/office/word/2012/wordml" xmlns:w16cex="http://schemas.microsoft.com/office/word/2018/wordml/cex" xmlns:w16cid="http://schemas.microsoft.com/office/word/2016/wordml/cid" xmlns:w16="http://schemas.microsoft.com/office/word/2018/wordml" xmlns:w16du="http://schemas.microsoft.com/office/word/2023/wordml/word16du" xmlns:w16sdtdh="http://schemas.microsoft.com/office/word/2020/wordml/sdtdatahash" xmlns:w16sdtfl="http://schemas.microsoft.com/office/word/2024/wordml/sdtformatlock" xmlns:w16se="http://schemas.microsoft.com/office/word/2015/wordml/symex" xmlns:wpg="http://schemas.microsoft.com/office/word/2010/wordprocessingGroup" xmlns:wpi="http://schemas.microsoft.com/office/word/2010/wordprocessingInk" xmlns:wne="http://schemas.microsoft.com/office/word/2006/wordml" xmlns:wps="http://schemas.microsoft.com/office/word/2010/wordprocessingShape" mc:Ignorable="w14 w15 w16se w16cid w16 w16cex w16sdtdh w16sdtfl w16du wp14">
   <w:abstractNum w:abstractNumId="0" w15:restartNumberingAfterBreak="0">
-    <w:nsid w:val="522D4EB4"/>
+    <w:nsid w:val="2D9723AF"/>
     <w:multiLevelType w:val="hybridMultilevel"/>
-    <w:tmpl w:val="00A40262"/>
+    <w:tmpl w:val="A42A647C"/>
     <w:lvl w:ilvl="0" w:tplc="10090011">
       <w:start w:val="1"/>
       <w:numFmt w:val="decimal"/>
@@ -385,7 +990,99 @@
       </w:pPr>
     </w:lvl>
   </w:abstractNum>
+  <w:abstractNum w:abstractNumId="1" w15:restartNumberingAfterBreak="0">
+    <w:nsid w:val="522D4EB4"/>
+    <w:multiLevelType w:val="hybridMultilevel"/>
+    <w:tmpl w:val="00A40262"/>
+    <w:lvl w:ilvl="0" w:tplc="10090011">
+      <w:start w:val="1"/>
+      <w:numFmt w:val="decimal"/>
+      <w:lvlText w:val="%1)"/>
+      <w:lvlJc w:val="left"/>
+      <w:pPr>
+        <w:ind w:left="720" w:hanging="360"/>
+      </w:pPr>
+      <w:rPr>
+        <w:rFonts w:hint="default"/>
+      </w:rPr>
+    </w:lvl>
+    <w:lvl w:ilvl="1" w:tplc="10090019" w:tentative="1">
+      <w:start w:val="1"/>
+      <w:numFmt w:val="lowerLetter"/>
+      <w:lvlText w:val="%2."/>
+      <w:lvlJc w:val="left"/>
+      <w:pPr>
+        <w:ind w:left="1440" w:hanging="360"/>
+      </w:pPr>
+    </w:lvl>
+    <w:lvl w:ilvl="2" w:tplc="1009001B" w:tentative="1">
+      <w:start w:val="1"/>
+      <w:numFmt w:val="lowerRoman"/>
+      <w:lvlText w:val="%3."/>
+      <w:lvlJc w:val="right"/>
+      <w:pPr>
+        <w:ind w:left="2160" w:hanging="180"/>
+      </w:pPr>
+    </w:lvl>
+    <w:lvl w:ilvl="3" w:tplc="1009000F" w:tentative="1">
+      <w:start w:val="1"/>
+      <w:numFmt w:val="decimal"/>
+      <w:lvlText w:val="%4."/>
+      <w:lvlJc w:val="left"/>
+      <w:pPr>
+        <w:ind w:left="2880" w:hanging="360"/>
+      </w:pPr>
+    </w:lvl>
+    <w:lvl w:ilvl="4" w:tplc="10090019" w:tentative="1">
+      <w:start w:val="1"/>
+      <w:numFmt w:val="lowerLetter"/>
+      <w:lvlText w:val="%5."/>
+      <w:lvlJc w:val="left"/>
+      <w:pPr>
+        <w:ind w:left="3600" w:hanging="360"/>
+      </w:pPr>
+    </w:lvl>
+    <w:lvl w:ilvl="5" w:tplc="1009001B" w:tentative="1">
+      <w:start w:val="1"/>
+      <w:numFmt w:val="lowerRoman"/>
+      <w:lvlText w:val="%6."/>
+      <w:lvlJc w:val="right"/>
+      <w:pPr>
+        <w:ind w:left="4320" w:hanging="180"/>
+      </w:pPr>
+    </w:lvl>
+    <w:lvl w:ilvl="6" w:tplc="1009000F" w:tentative="1">
+      <w:start w:val="1"/>
+      <w:numFmt w:val="decimal"/>
+      <w:lvlText w:val="%7."/>
+      <w:lvlJc w:val="left"/>
+      <w:pPr>
+        <w:ind w:left="5040" w:hanging="360"/>
+      </w:pPr>
+    </w:lvl>
+    <w:lvl w:ilvl="7" w:tplc="10090019" w:tentative="1">
+      <w:start w:val="1"/>
+      <w:numFmt w:val="lowerLetter"/>
+      <w:lvlText w:val="%8."/>
+      <w:lvlJc w:val="left"/>
+      <w:pPr>
+        <w:ind w:left="5760" w:hanging="360"/>
+      </w:pPr>
+    </w:lvl>
+    <w:lvl w:ilvl="8" w:tplc="1009001B" w:tentative="1">
+      <w:start w:val="1"/>
+      <w:numFmt w:val="lowerRoman"/>
+      <w:lvlText w:val="%9."/>
+      <w:lvlJc w:val="right"/>
+      <w:pPr>
+        <w:ind w:left="6480" w:hanging="180"/>
+      </w:pPr>
+    </w:lvl>
+  </w:abstractNum>
   <w:num w:numId="1" w16cid:durableId="620498887">
+    <w:abstractNumId w:val="1"/>
+  </w:num>
+  <w:num w:numId="2" w16cid:durableId="2049404516">
     <w:abstractNumId w:val="0"/>
   </w:num>
 </w:numbering>

</xml_diff>